<commit_message>
docs: release 1.0.0 with guides, decision reversal and final documentation
Adds the four guides (installation and deployment, user, developer, FAQ and troubleshooting) in Markdown and Word, the final README and the MIT license.

Adds decision reversal (CR-19, FR-REV-12): a senior other than the decider reverses a decision in an open month; the decision stays on record and a new audit event references it. Updates DOC-02, DOC-03, DOC-05 (ADR-32 to ADR-34), DOC-06 (254 tests) and DOC-07 (review results). Fixes the retired AI model fallback and duplicate test IDs.
</commit_message>
<xml_diff>
--- a/docs/word-files/02_requirements_specification.docx
+++ b/docs/word-files/02_requirements_specification.docx
@@ -505,23 +505,7 @@
         <w:pStyle w:val="BodyText"/>
       </w:pPr>
       <w:r>
-        <w:t xml:space="preserve">All requirements are mandatory except FR-GAI (optional capability). Items marked</w:t>
-      </w:r>
-      <w:r>
-        <w:t xml:space="preserve"> </w:t>
-      </w:r>
-      <w:r>
-        <w:rPr>
-          <w:iCs/>
-          <w:i/>
-        </w:rPr>
-        <w:t xml:space="preserve">pending</w:t>
-      </w:r>
-      <w:r>
-        <w:t xml:space="preserve"> </w:t>
-      </w:r>
-      <w:r>
-        <w:t xml:space="preserve">depend on sponsor decisions DD-01 (BR-19, PRM-09, FR-EVL-02, FR-EVL-03; needed before Stage 7) and DD-02 (CR-11, FR-REV-06; needed before Stage 5). The</w:t>
+        <w:t xml:space="preserve">All requirements are mandatory except FR-GAI (optional capability). Two design decisions shape specific items and are reported to the sponsor, who may revise them: DD-01, the false automatic match rate reported as a hypothetical (BR-19, PRM-09, FR-EVL-02, FR-EVL-03), and DD-02, one decision record per item in a batch (CR-11, FR-REV-06). The</w:t>
       </w:r>
       <w:r>
         <w:t xml:space="preserve"> </w:t>
@@ -3456,7 +3440,7 @@
               <w:jc w:val="left"/>
             </w:pPr>
             <w:r>
-              <w:t xml:space="preserve">Confirmed in Stage 7</w:t>
+              <w:t xml:space="preserve">Confirmed on calibration data</w:t>
             </w:r>
           </w:p>
         </w:tc>
@@ -3506,7 +3490,7 @@
               <w:jc w:val="left"/>
             </w:pPr>
             <w:r>
-              <w:t xml:space="preserve">Confirmed in Stage 7</w:t>
+              <w:t xml:space="preserve">Confirmed on calibration data</w:t>
             </w:r>
           </w:p>
         </w:tc>
@@ -3556,7 +3540,7 @@
               <w:jc w:val="left"/>
             </w:pPr>
             <w:r>
-              <w:t xml:space="preserve">Confirmed in Stage 7</w:t>
+              <w:t xml:space="preserve">Confirmed on calibration data</w:t>
             </w:r>
           </w:p>
         </w:tc>
@@ -3616,7 +3600,7 @@
               <w:jc w:val="left"/>
             </w:pPr>
             <w:r>
-              <w:t xml:space="preserve">DD-01 (pending)</w:t>
+              <w:t xml:space="preserve">DD-01</w:t>
             </w:r>
           </w:p>
         </w:tc>
@@ -5659,7 +5643,7 @@
               <w:jc w:val="left"/>
             </w:pPr>
             <w:r>
-              <w:t xml:space="preserve">§5, DD-02 (pending)</w:t>
+              <w:t xml:space="preserve">§5, DD-02</w:t>
             </w:r>
           </w:p>
         </w:tc>
@@ -5866,6 +5850,44 @@
             </w:pPr>
             <w:r>
               <w:t xml:space="preserve">DD-04</w:t>
+            </w:r>
+          </w:p>
+        </w:tc>
+      </w:tr>
+      <w:tr>
+        <w:tc>
+          <w:tcPr/>
+          <w:p>
+            <w:pPr>
+              <w:pStyle w:val="Compact"/>
+              <w:jc w:val="left"/>
+            </w:pPr>
+            <w:r>
+              <w:t xml:space="preserve">FR-REV-12</w:t>
+            </w:r>
+          </w:p>
+        </w:tc>
+        <w:tc>
+          <w:tcPr/>
+          <w:p>
+            <w:pPr>
+              <w:pStyle w:val="Compact"/>
+              <w:jc w:val="left"/>
+            </w:pPr>
+            <w:r>
+              <w:t xml:space="preserve">Reverse a final decision while the period is open: the decision stays on record, the reversal is a new event that references it, and the item returns to review</w:t>
+            </w:r>
+          </w:p>
+        </w:tc>
+        <w:tc>
+          <w:tcPr/>
+          <w:p>
+            <w:pPr>
+              <w:pStyle w:val="Compact"/>
+              <w:jc w:val="left"/>
+            </w:pPr>
+            <w:r>
+              <w:t xml:space="preserve">§7</w:t>
             </w:r>
           </w:p>
         </w:tc>
@@ -7059,7 +7081,7 @@
               <w:jc w:val="left"/>
             </w:pPr>
             <w:r>
-              <w:t xml:space="preserve">§11, DD-01 (pending)</w:t>
+              <w:t xml:space="preserve">§11, DD-01</w:t>
             </w:r>
           </w:p>
         </w:tc>
@@ -10262,7 +10284,7 @@
               <w:jc w:val="left"/>
             </w:pPr>
             <w:r>
-              <w:t xml:space="preserve">DD-02 (pending)</w:t>
+              <w:t xml:space="preserve">DD-02</w:t>
             </w:r>
           </w:p>
         </w:tc>
@@ -10517,6 +10539,44 @@
             </w:pPr>
             <w:r>
               <w:t xml:space="preserve">After close, an item’s decision can change only through an approved reopening</w:t>
+            </w:r>
+          </w:p>
+        </w:tc>
+        <w:tc>
+          <w:tcPr/>
+          <w:p>
+            <w:pPr>
+              <w:pStyle w:val="Compact"/>
+              <w:jc w:val="left"/>
+            </w:pPr>
+            <w:r>
+              <w:t xml:space="preserve">§7</w:t>
+            </w:r>
+          </w:p>
+        </w:tc>
+      </w:tr>
+      <w:tr>
+        <w:tc>
+          <w:tcPr/>
+          <w:p>
+            <w:pPr>
+              <w:pStyle w:val="Compact"/>
+              <w:jc w:val="left"/>
+            </w:pPr>
+            <w:r>
+              <w:t xml:space="preserve">CR-19</w:t>
+            </w:r>
+          </w:p>
+        </w:tc>
+        <w:tc>
+          <w:tcPr/>
+          <w:p>
+            <w:pPr>
+              <w:pStyle w:val="Compact"/>
+              <w:jc w:val="left"/>
+            </w:pPr>
+            <w:r>
+              <w:t xml:space="preserve">A decision is reversed only by a Senior Accountant or Controller who did not make it, with a comment, in an open period, and never while an adjustment for the item is proposed or approved</w:t>
             </w:r>
           </w:p>
         </w:tc>
@@ -11939,7 +11999,7 @@
               <w:jc w:val="left"/>
             </w:pPr>
             <w:r>
-              <w:t xml:space="preserve">CAT-01..05; CR-01..03, CR-11, CR-16; FR-REV-01..11</w:t>
+              <w:t xml:space="preserve">CAT-01..05; CR-01..03, CR-11, CR-16, CR-19; FR-REV-01..12</w:t>
             </w:r>
           </w:p>
         </w:tc>
@@ -12409,7 +12469,7 @@
               <w:jc w:val="left"/>
             </w:pPr>
             <w:r>
-              <w:t xml:space="preserve">BR-01..19, CR-01..18, FR-RSK-01</w:t>
+              <w:t xml:space="preserve">BR-01..19, CR-01..19, FR-RSK-01</w:t>
             </w:r>
           </w:p>
         </w:tc>
@@ -12599,7 +12659,7 @@
               <w:jc w:val="left"/>
             </w:pPr>
             <w:r>
-              <w:t xml:space="preserve">FR-AUD-06, FR-REV-07, CR-09, CR-18</w:t>
+              <w:t xml:space="preserve">FR-AUD-06, FR-REV-07, FR-REV-12, CR-09, CR-18, CR-19</w:t>
             </w:r>
           </w:p>
         </w:tc>
@@ -13246,7 +13306,7 @@
     <w:basedOn w:val="BodyTextChar"/>
     <w:rPr>
       <w:rFonts w:ascii="Consolas" w:hAnsi="Consolas"/>
-      <w:sz w:val="22"/>
+      <w:sz w:val="17"/>
     </w:rPr>
   </w:style>
   <w:style w:customStyle="1" w:styleId="SectionNumber" w:type="character">
@@ -13285,15 +13345,18 @@
       <w:color w:themeColor="accent1" w:themeShade="BF" w:val="365F91"/>
     </w:rPr>
   </w:style>
-  <w:style w:type="paragraph" w:customStyle="1" w:styleId="SourceCode">
+  <w:style w:customStyle="1" w:styleId="SourceCode" w:type="paragraph">
     <w:name w:val="Source Code"/>
     <w:basedOn w:val="Normal"/>
     <w:link w:val="VerbatimChar"/>
     <w:pPr>
       <w:wordWrap w:val="off"/>
     </w:pPr>
+    <w:rPr>
+      <w:sz w:val="17"/>
+    </w:rPr>
   </w:style>
-  <w:style w:type="character" w:customStyle="1" w:styleId="KeywordTok">
+  <w:style w:customStyle="1" w:styleId="KeywordTok" w:type="character">
     <w:name w:val="KeywordTok"/>
     <w:basedOn w:val="VerbatimChar"/>
     <w:rPr>
@@ -13301,77 +13364,77 @@
       <w:b/>
     </w:rPr>
   </w:style>
-  <w:style w:type="character" w:customStyle="1" w:styleId="DataTypeTok">
+  <w:style w:customStyle="1" w:styleId="DataTypeTok" w:type="character">
     <w:name w:val="DataTypeTok"/>
     <w:basedOn w:val="VerbatimChar"/>
     <w:rPr>
       <w:color w:val="902000"/>
     </w:rPr>
   </w:style>
-  <w:style w:type="character" w:customStyle="1" w:styleId="DecValTok">
+  <w:style w:customStyle="1" w:styleId="DecValTok" w:type="character">
     <w:name w:val="DecValTok"/>
     <w:basedOn w:val="VerbatimChar"/>
     <w:rPr>
       <w:color w:val="40a070"/>
     </w:rPr>
   </w:style>
-  <w:style w:type="character" w:customStyle="1" w:styleId="BaseNTok">
+  <w:style w:customStyle="1" w:styleId="BaseNTok" w:type="character">
     <w:name w:val="BaseNTok"/>
     <w:basedOn w:val="VerbatimChar"/>
     <w:rPr>
       <w:color w:val="40a070"/>
     </w:rPr>
   </w:style>
-  <w:style w:type="character" w:customStyle="1" w:styleId="FloatTok">
+  <w:style w:customStyle="1" w:styleId="FloatTok" w:type="character">
     <w:name w:val="FloatTok"/>
     <w:basedOn w:val="VerbatimChar"/>
     <w:rPr>
       <w:color w:val="40a070"/>
     </w:rPr>
   </w:style>
-  <w:style w:type="character" w:customStyle="1" w:styleId="ConstantTok">
+  <w:style w:customStyle="1" w:styleId="ConstantTok" w:type="character">
     <w:name w:val="ConstantTok"/>
     <w:basedOn w:val="VerbatimChar"/>
     <w:rPr>
       <w:color w:val="880000"/>
     </w:rPr>
   </w:style>
-  <w:style w:type="character" w:customStyle="1" w:styleId="CharTok">
+  <w:style w:customStyle="1" w:styleId="CharTok" w:type="character">
     <w:name w:val="CharTok"/>
     <w:basedOn w:val="VerbatimChar"/>
     <w:rPr>
       <w:color w:val="4070a0"/>
     </w:rPr>
   </w:style>
-  <w:style w:type="character" w:customStyle="1" w:styleId="SpecialCharTok">
+  <w:style w:customStyle="1" w:styleId="SpecialCharTok" w:type="character">
     <w:name w:val="SpecialCharTok"/>
     <w:basedOn w:val="VerbatimChar"/>
     <w:rPr>
       <w:color w:val="4070a0"/>
     </w:rPr>
   </w:style>
-  <w:style w:type="character" w:customStyle="1" w:styleId="StringTok">
+  <w:style w:customStyle="1" w:styleId="StringTok" w:type="character">
     <w:name w:val="StringTok"/>
     <w:basedOn w:val="VerbatimChar"/>
     <w:rPr>
       <w:color w:val="4070a0"/>
     </w:rPr>
   </w:style>
-  <w:style w:type="character" w:customStyle="1" w:styleId="VerbatimStringTok">
+  <w:style w:customStyle="1" w:styleId="VerbatimStringTok" w:type="character">
     <w:name w:val="VerbatimStringTok"/>
     <w:basedOn w:val="VerbatimChar"/>
     <w:rPr>
       <w:color w:val="4070a0"/>
     </w:rPr>
   </w:style>
-  <w:style w:type="character" w:customStyle="1" w:styleId="SpecialStringTok">
+  <w:style w:customStyle="1" w:styleId="SpecialStringTok" w:type="character">
     <w:name w:val="SpecialStringTok"/>
     <w:basedOn w:val="VerbatimChar"/>
     <w:rPr>
       <w:color w:val="bb6688"/>
     </w:rPr>
   </w:style>
-  <w:style w:type="character" w:customStyle="1" w:styleId="ImportTok">
+  <w:style w:customStyle="1" w:styleId="ImportTok" w:type="character">
     <w:name w:val="ImportTok"/>
     <w:basedOn w:val="VerbatimChar"/>
     <w:rPr>
@@ -13379,7 +13442,7 @@
       <w:b/>
     </w:rPr>
   </w:style>
-  <w:style w:type="character" w:customStyle="1" w:styleId="CommentTok">
+  <w:style w:customStyle="1" w:styleId="CommentTok" w:type="character">
     <w:name w:val="CommentTok"/>
     <w:basedOn w:val="VerbatimChar"/>
     <w:rPr>
@@ -13387,7 +13450,7 @@
       <w:i/>
     </w:rPr>
   </w:style>
-  <w:style w:type="character" w:customStyle="1" w:styleId="DocumentationTok">
+  <w:style w:customStyle="1" w:styleId="DocumentationTok" w:type="character">
     <w:name w:val="DocumentationTok"/>
     <w:basedOn w:val="VerbatimChar"/>
     <w:rPr>
@@ -13395,7 +13458,7 @@
       <w:i/>
     </w:rPr>
   </w:style>
-  <w:style w:type="character" w:customStyle="1" w:styleId="AnnotationTok">
+  <w:style w:customStyle="1" w:styleId="AnnotationTok" w:type="character">
     <w:name w:val="AnnotationTok"/>
     <w:basedOn w:val="VerbatimChar"/>
     <w:rPr>
@@ -13404,7 +13467,7 @@
       <w:i/>
     </w:rPr>
   </w:style>
-  <w:style w:type="character" w:customStyle="1" w:styleId="CommentVarTok">
+  <w:style w:customStyle="1" w:styleId="CommentVarTok" w:type="character">
     <w:name w:val="CommentVarTok"/>
     <w:basedOn w:val="VerbatimChar"/>
     <w:rPr>
@@ -13413,28 +13476,28 @@
       <w:i/>
     </w:rPr>
   </w:style>
-  <w:style w:type="character" w:customStyle="1" w:styleId="OtherTok">
+  <w:style w:customStyle="1" w:styleId="OtherTok" w:type="character">
     <w:name w:val="OtherTok"/>
     <w:basedOn w:val="VerbatimChar"/>
     <w:rPr>
       <w:color w:val="007020"/>
     </w:rPr>
   </w:style>
-  <w:style w:type="character" w:customStyle="1" w:styleId="FunctionTok">
+  <w:style w:customStyle="1" w:styleId="FunctionTok" w:type="character">
     <w:name w:val="FunctionTok"/>
     <w:basedOn w:val="VerbatimChar"/>
     <w:rPr>
       <w:color w:val="06287e"/>
     </w:rPr>
   </w:style>
-  <w:style w:type="character" w:customStyle="1" w:styleId="VariableTok">
+  <w:style w:customStyle="1" w:styleId="VariableTok" w:type="character">
     <w:name w:val="VariableTok"/>
     <w:basedOn w:val="VerbatimChar"/>
     <w:rPr>
       <w:color w:val="19177c"/>
     </w:rPr>
   </w:style>
-  <w:style w:type="character" w:customStyle="1" w:styleId="ControlFlowTok">
+  <w:style w:customStyle="1" w:styleId="ControlFlowTok" w:type="character">
     <w:name w:val="ControlFlowTok"/>
     <w:basedOn w:val="VerbatimChar"/>
     <w:rPr>
@@ -13442,45 +13505,45 @@
       <w:b/>
     </w:rPr>
   </w:style>
-  <w:style w:type="character" w:customStyle="1" w:styleId="OperatorTok">
+  <w:style w:customStyle="1" w:styleId="OperatorTok" w:type="character">
     <w:name w:val="OperatorTok"/>
     <w:basedOn w:val="VerbatimChar"/>
     <w:rPr>
       <w:color w:val="666666"/>
     </w:rPr>
   </w:style>
-  <w:style w:type="character" w:customStyle="1" w:styleId="BuiltInTok">
+  <w:style w:customStyle="1" w:styleId="BuiltInTok" w:type="character">
     <w:name w:val="BuiltInTok"/>
     <w:basedOn w:val="VerbatimChar"/>
     <w:rPr>
       <w:color w:val="008000"/>
     </w:rPr>
   </w:style>
-  <w:style w:type="character" w:customStyle="1" w:styleId="ExtensionTok">
+  <w:style w:customStyle="1" w:styleId="ExtensionTok" w:type="character">
     <w:name w:val="ExtensionTok"/>
     <w:basedOn w:val="VerbatimChar"/>
     <w:rPr/>
   </w:style>
-  <w:style w:type="character" w:customStyle="1" w:styleId="PreprocessorTok">
+  <w:style w:customStyle="1" w:styleId="PreprocessorTok" w:type="character">
     <w:name w:val="PreprocessorTok"/>
     <w:basedOn w:val="VerbatimChar"/>
     <w:rPr>
       <w:color w:val="bc7a00"/>
     </w:rPr>
   </w:style>
-  <w:style w:type="character" w:customStyle="1" w:styleId="AttributeTok">
+  <w:style w:customStyle="1" w:styleId="AttributeTok" w:type="character">
     <w:name w:val="AttributeTok"/>
     <w:basedOn w:val="VerbatimChar"/>
     <w:rPr>
       <w:color w:val="7d9029"/>
     </w:rPr>
   </w:style>
-  <w:style w:type="character" w:customStyle="1" w:styleId="RegionMarkerTok">
+  <w:style w:customStyle="1" w:styleId="RegionMarkerTok" w:type="character">
     <w:name w:val="RegionMarkerTok"/>
     <w:basedOn w:val="VerbatimChar"/>
     <w:rPr/>
   </w:style>
-  <w:style w:type="character" w:customStyle="1" w:styleId="InformationTok">
+  <w:style w:customStyle="1" w:styleId="InformationTok" w:type="character">
     <w:name w:val="InformationTok"/>
     <w:basedOn w:val="VerbatimChar"/>
     <w:rPr>
@@ -13489,7 +13552,7 @@
       <w:i/>
     </w:rPr>
   </w:style>
-  <w:style w:type="character" w:customStyle="1" w:styleId="WarningTok">
+  <w:style w:customStyle="1" w:styleId="WarningTok" w:type="character">
     <w:name w:val="WarningTok"/>
     <w:basedOn w:val="VerbatimChar"/>
     <w:rPr>
@@ -13498,7 +13561,7 @@
       <w:i/>
     </w:rPr>
   </w:style>
-  <w:style w:type="character" w:customStyle="1" w:styleId="AlertTok">
+  <w:style w:customStyle="1" w:styleId="AlertTok" w:type="character">
     <w:name w:val="AlertTok"/>
     <w:basedOn w:val="VerbatimChar"/>
     <w:rPr>
@@ -13506,7 +13569,7 @@
       <w:b/>
     </w:rPr>
   </w:style>
-  <w:style w:type="character" w:customStyle="1" w:styleId="ErrorTok">
+  <w:style w:customStyle="1" w:styleId="ErrorTok" w:type="character">
     <w:name w:val="ErrorTok"/>
     <w:basedOn w:val="VerbatimChar"/>
     <w:rPr>
@@ -13514,7 +13577,7 @@
       <w:b/>
     </w:rPr>
   </w:style>
-  <w:style w:type="character" w:customStyle="1" w:styleId="NormalTok">
+  <w:style w:customStyle="1" w:styleId="NormalTok" w:type="character">
     <w:name w:val="NormalTok"/>
     <w:basedOn w:val="VerbatimChar"/>
     <w:rPr/>

</xml_diff>